<commit_message>
AI vision: thêm S1 (hồ sơ tình huống địa điểm nhiều đơn vị), K12 (quy trình vận hành điểm kiểm soát ra vào), K13 (biên bản đo thử độ chính xác)
- S1: sáu quyết định cần chốt; danh mục 22 hồ sơ theo 6 giai đoạn; cấu hình khuyến nghị; cập nhật DPIA định kỳ theo NĐ 356 Đ20.1
- K12: bàn đăng ký, xử lý tại cổng, khóa quyền và xóa, rà soát định kỳ, bảng tổng hợp; sổ theo dõi, biên bản rà soát
- K13: đo từ chối nhầm, nhận nhầm người lạ, giả mạo theo từng cổng; tiêu chí chốt trước; quy tắc 3/n
- Cập nhật K8 B10b, P1, bản thảo luận, danh mục, dữ liệu mẫu, bản Word

Co-Authored-By: Claude Opus 5.5 <noreply@anthropic.com>
Claude-Session: https://claude.ai/code/session_01Cob8EJkgsHZYQRqhfdnueU
</commit_message>
<xml_diff>
--- a/templates/09-ai-vision/k8-checklist-trien-khai-ban-giao.docx
+++ b/templates/09-ai-vision/k8-checklist-trien-khai-ban-giao.docx
@@ -6126,7 +6126,7 @@
                 <w:sz w:val="22"/>
                 <w:szCs w:val="22"/>
               </w:rPr>
-              <w:t xml:space="preserve"> lượt; ghi kết quả vào biên bản</w:t>
+              <w:t xml:space="preserve"> lượt; ghi kết quả vào biên bản đo thử (K13)</w:t>
             </w:r>
           </w:p>
         </w:tc>
@@ -10469,7 +10469,7 @@
                 <w:sz w:val="22"/>
                 <w:szCs w:val="22"/>
               </w:rPr>
-              <w:t xml:space="preserve">Bàn giao bộ công cụ K1–K11 và hướng dẫn điền; giải thích phần khách hàng phải tự ban hành</w:t>
+              <w:t xml:space="preserve">Bàn giao bộ công cụ K1–K13 và hướng dẫn điền; giải thích phần khách hàng phải tự ban hành</w:t>
             </w:r>
           </w:p>
         </w:tc>

</xml_diff>